<commit_message>
Milestone 4 Team 5 Assignments
</commit_message>
<xml_diff>
--- a/03_Team_Work/Team5/Milestone_4_Interfaces_and_Data_Structures/Assignments/M4_T5_API_Message_Specification_Standards.docx
+++ b/03_Team_Work/Team5/Milestone_4_Interfaces_and_Data_Structures/Assignments/M4_T5_API_Message_Specification_Standards.docx
@@ -1261,22 +1261,7 @@
         <w:t>AnalyticsEventRequest</w:t>
       </w:r>
       <w:r>
-        <w:t>: J</w:t>
-      </w:r>
-      <w:r>
-        <w:t>obPostingAnalyticsRequest</w:t>
-      </w:r>
-      <w:r>
-        <w:t xml:space="preserve">, </w:t>
-      </w:r>
-      <w:r>
-        <w:t>CandidateSearchAnalyticsRequest</w:t>
-      </w:r>
-      <w:r>
-        <w:t xml:space="preserve">, </w:t>
-      </w:r>
-      <w:r>
-        <w:t>ProfileResumeEngagementRequest</w:t>
+        <w:t>: JobPostingAnalyticsRequest, CandidateSearchAnalyticsRequest, ProfileResumeEngagementRequest</w:t>
       </w:r>
     </w:p>
     <w:p>
@@ -1294,25 +1279,7 @@
         <w:t>AnalyticsEventResponse</w:t>
       </w:r>
       <w:r>
-        <w:t xml:space="preserve">: </w:t>
-      </w:r>
-      <w:r>
-        <w:t>JobPostingAnalyticsRe</w:t>
-      </w:r>
-      <w:r>
-        <w:t>sponse</w:t>
-      </w:r>
-      <w:r>
-        <w:t>, CandidateSearchAnalyticsRe</w:t>
-      </w:r>
-      <w:r>
-        <w:t>sponse</w:t>
-      </w:r>
-      <w:r>
-        <w:t>, ProfileResumeEngagementRe</w:t>
-      </w:r>
-      <w:r>
-        <w:t>sponse</w:t>
+        <w:t>: JobPostingAnalyticsResponse, CandidateSearchAnalyticsResponse, ProfileResumeEngagementResponse</w:t>
       </w:r>
     </w:p>
     <w:p>
@@ -1361,25 +1328,13 @@
         </w:numPr>
       </w:pPr>
       <w:r>
-        <w:t xml:space="preserve"> </w:t>
-      </w:r>
-      <w:r>
-        <w:t>PushNotificationResponse</w:t>
+        <w:t xml:space="preserve"> PushNotificationResponse</w:t>
       </w:r>
     </w:p>
     <w:p/>
     <w:p>
       <w:r>
-        <w:t>1.4.11 — External Services Orchestrator</w:t>
-      </w:r>
-      <w:r>
-        <w:t xml:space="preserve"> AND </w:t>
-      </w:r>
-      <w:r>
-        <w:t>1.4.12 — Analytics Orchestrator</w:t>
-      </w:r>
-      <w:r>
-        <w:t xml:space="preserve"> don’t </w:t>
+        <w:t xml:space="preserve">1.4.11 — External Services Orchestrator AND 1.4.12 — Analytics Orchestrator don’t </w:t>
       </w:r>
       <w:r>
         <w:t xml:space="preserve">require </w:t>
@@ -1393,8 +1348,22 @@
     </w:p>
     <w:p/>
     <w:p>
+      <w:pPr>
+        <w:rPr>
+          <w:color w:val="EE0000"/>
+        </w:rPr>
+      </w:pPr>
       <w:r>
         <w:t>USPS Address Validation Adapter</w:t>
+      </w:r>
+      <w:r>
+        <w:t xml:space="preserve"> - </w:t>
+      </w:r>
+      <w:r>
+        <w:rPr>
+          <w:color w:val="EE0000"/>
+        </w:rPr>
+        <w:t>William</w:t>
       </w:r>
     </w:p>
     <w:p>
@@ -1418,15 +1387,26 @@
         </w:numPr>
       </w:pPr>
       <w:r>
-        <w:t xml:space="preserve">1.12.1 – API </w:t>
-      </w:r>
-      <w:r>
-        <w:t>AddressValidationResponse</w:t>
+        <w:t>1.12.1 – API AddressValidationResponse</w:t>
       </w:r>
     </w:p>
     <w:p>
+      <w:pPr>
+        <w:rPr>
+          <w:color w:val="EE0000"/>
+        </w:rPr>
+      </w:pPr>
       <w:r>
         <w:t>Autocomplete API Adapter</w:t>
+      </w:r>
+      <w:r>
+        <w:t xml:space="preserve"> - </w:t>
+      </w:r>
+      <w:r>
+        <w:rPr>
+          <w:color w:val="EE0000"/>
+        </w:rPr>
+        <w:t>Wessley</w:t>
       </w:r>
     </w:p>
     <w:p>
@@ -1438,10 +1418,7 @@
         </w:numPr>
       </w:pPr>
       <w:r>
-        <w:t xml:space="preserve">1.12.2 – API </w:t>
-      </w:r>
-      <w:r>
-        <w:t>AutocompleteRequest</w:t>
+        <w:t>1.12.2 – API AutocompleteRequest</w:t>
       </w:r>
     </w:p>
     <w:p>
@@ -1453,15 +1430,26 @@
         </w:numPr>
       </w:pPr>
       <w:r>
-        <w:t xml:space="preserve">1.12.2 – API </w:t>
-      </w:r>
-      <w:r>
-        <w:t>AutocompleteResponse</w:t>
+        <w:t>1.12.2 – API AutocompleteResponse</w:t>
       </w:r>
     </w:p>
     <w:p>
+      <w:pPr>
+        <w:rPr>
+          <w:color w:val="EE0000"/>
+        </w:rPr>
+      </w:pPr>
       <w:r>
         <w:t>Push Notification Gateway</w:t>
+      </w:r>
+      <w:r>
+        <w:t xml:space="preserve"> – </w:t>
+      </w:r>
+      <w:r>
+        <w:rPr>
+          <w:color w:val="EE0000"/>
+        </w:rPr>
+        <w:t>Ethan S.</w:t>
       </w:r>
     </w:p>
     <w:p>
@@ -1552,6 +1540,11 @@
     <w:p/>
     <w:p/>
     <w:p>
+      <w:pPr>
+        <w:rPr>
+          <w:color w:val="EE0000"/>
+        </w:rPr>
+      </w:pPr>
       <w:r>
         <w:t>Job Posting</w:t>
       </w:r>
@@ -1560,6 +1553,15 @@
       </w:r>
       <w:r>
         <w:t>Analytics</w:t>
+      </w:r>
+      <w:r>
+        <w:t xml:space="preserve"> - </w:t>
+      </w:r>
+      <w:r>
+        <w:rPr>
+          <w:color w:val="EE0000"/>
+        </w:rPr>
+        <w:t>Dallin</w:t>
       </w:r>
     </w:p>
     <w:p>
@@ -1587,8 +1589,22 @@
       </w:r>
     </w:p>
     <w:p>
+      <w:pPr>
+        <w:rPr>
+          <w:color w:val="EE0000"/>
+        </w:rPr>
+      </w:pPr>
       <w:r>
         <w:t>Search and Candidate Analytics</w:t>
+      </w:r>
+      <w:r>
+        <w:t xml:space="preserve"> - </w:t>
+      </w:r>
+      <w:r>
+        <w:rPr>
+          <w:color w:val="EE0000"/>
+        </w:rPr>
+        <w:t>Dallin</w:t>
       </w:r>
     </w:p>
     <w:p>
@@ -1616,11 +1632,25 @@
       </w:r>
     </w:p>
     <w:p>
+      <w:pPr>
+        <w:rPr>
+          <w:color w:val="EE0000"/>
+        </w:rPr>
+      </w:pPr>
       <w:r>
         <w:t>Profile and Resume Enga</w:t>
       </w:r>
       <w:r>
         <w:t>gement</w:t>
+      </w:r>
+      <w:r>
+        <w:t xml:space="preserve"> - </w:t>
+      </w:r>
+      <w:r>
+        <w:rPr>
+          <w:color w:val="EE0000"/>
+        </w:rPr>
+        <w:t>William</w:t>
       </w:r>
     </w:p>
     <w:p>
@@ -1648,8 +1678,22 @@
       </w:r>
     </w:p>
     <w:p>
+      <w:pPr>
+        <w:rPr>
+          <w:color w:val="EE0000"/>
+        </w:rPr>
+      </w:pPr>
       <w:r>
         <w:t>Notification and News Feed Analytics</w:t>
+      </w:r>
+      <w:r>
+        <w:t xml:space="preserve"> – </w:t>
+      </w:r>
+      <w:r>
+        <w:rPr>
+          <w:color w:val="EE0000"/>
+        </w:rPr>
+        <w:t>Ethan S.</w:t>
       </w:r>
     </w:p>
     <w:p>
@@ -1683,8 +1727,22 @@
       </w:r>
     </w:p>
     <w:p>
+      <w:pPr>
+        <w:rPr>
+          <w:color w:val="EE0000"/>
+        </w:rPr>
+      </w:pPr>
       <w:r>
         <w:t>Performance Monitor</w:t>
+      </w:r>
+      <w:r>
+        <w:t xml:space="preserve"> - </w:t>
+      </w:r>
+      <w:r>
+        <w:rPr>
+          <w:color w:val="EE0000"/>
+        </w:rPr>
+        <w:t>Adam</w:t>
       </w:r>
     </w:p>
     <w:p>

</xml_diff>